<commit_message>
Manual: cabecalho em todas as paginas, menos a capa
Titulo a esquerda e versao a direita, em cinza de 8,5pt, com um fio fino
embaixo. A versao sai do versaoxxx.txt na hora de gerar, entao acompanha
sozinha. A capa fica limpa por "primeira pagina diferente".

Co-Authored-By: Claude Opus 5 (1M context) <noreply@anthropic.com>
</commit_message>
<xml_diff>
--- a/manual/Manual_de_Regras_Folha10_Simples.docx
+++ b/manual/Manual_de_Regras_Folha10_Simples.docx
@@ -9627,13 +9627,48 @@
       </w:r>
     </w:p>
     <w:sectPr>
+      <w:headerReference w:type="default" r:id="rId9"/>
       <w:pgSz w:w="12240" w:h="15840"/>
       <w:pgMar w:top="1134" w:right="1247" w:bottom="1134" w:left="1247" w:header="720" w:footer="720" w:gutter="0"/>
       <w:cols w:space="720"/>
+      <w:titlePg/>
       <w:docGrid w:linePitch="360"/>
     </w:sectPr>
   </w:body>
 </w:document>
+</file>
+
+<file path=word/header1.xml><?xml version="1.0" encoding="utf-8"?>
+<w:hdr xmlns:m="http://schemas.openxmlformats.org/officeDocument/2006/math" xmlns:mc="http://schemas.openxmlformats.org/markup-compatibility/2006" xmlns:mo="http://schemas.microsoft.com/office/mac/office/2008/main" xmlns:mv="urn:schemas-microsoft-com:mac:vml" xmlns:o="urn:schemas-microsoft-com:office:office" xmlns:r="http://schemas.openxmlformats.org/officeDocument/2006/relationships" xmlns:v="urn:schemas-microsoft-com:vml" xmlns:w10="urn:schemas-microsoft-com:office:word" xmlns:w14="http://schemas.microsoft.com/office/word/2010/wordml" xmlns:w="http://schemas.openxmlformats.org/wordprocessingml/2006/main" xmlns:wne="http://schemas.microsoft.com/office/word/2006/wordml" xmlns:wp14="http://schemas.microsoft.com/office/word/2010/wordprocessingDrawing" xmlns:wp="http://schemas.openxmlformats.org/drawingml/2006/wordprocessingDrawing" xmlns:wpc="http://schemas.microsoft.com/office/word/2010/wordprocessingCanvas" xmlns:wpg="http://schemas.microsoft.com/office/word/2010/wordprocessingGroup" xmlns:wpi="http://schemas.microsoft.com/office/word/2010/wordprocessingInk" xmlns:wps="http://schemas.microsoft.com/office/word/2010/wordprocessingShape" mc:Ignorable="w14 wp14">
+  <w:p>
+    <w:pPr>
+      <w:pStyle w:val="Header"/>
+      <w:tabs>
+        <w:tab w:pos="9746" w:val="right"/>
+      </w:tabs>
+      <w:spacing w:after="80"/>
+      <w:pBdr>
+        <w:bottom w:val="single" w:sz="4" w:space="4" w:color="C7D2E4"/>
+      </w:pBdr>
+    </w:pPr>
+    <w:r/>
+    <w:r>
+      <w:rPr>
+        <w:color w:val="475569"/>
+        <w:sz w:val="17"/>
+      </w:rPr>
+      <w:t>Folha10 Simples — Manual de Regras do Sistema</w:t>
+    </w:r>
+    <w:r>
+      <w:rPr>
+        <w:color w:val="475569"/>
+        <w:sz w:val="17"/>
+      </w:rPr>
+      <w:tab/>
+      <w:t>versão 20260809-0921</w:t>
+    </w:r>
+  </w:p>
+</w:hdr>
 </file>
 
 <file path=word/numbering.xml><?xml version="1.0" encoding="utf-8"?>

</xml_diff>

<commit_message>
Manual do Usuario e botao Manual no menu
Manual de OPERACAO, 24 paginas, do primeiro cadastro ao fechamento do mes,
dividido pelos cards do menu. Escrito para quem usa o sistema: sem nome de
tabela, de coluna ou de rotina. Fecha com a rotina do mes em 17 passos e as
duvidas mais comuns.

O manual de regras continua existindo, mas e interno — o botao do menu abre o
do usuario, e so o PDF dele viaja no repositorio (o servidor nao tem Word para
gerar). Preferencias nao saiu do lugar: os dois botoes agora dividem um flex,
para o rotulo de um nao desalinhar o outro.

O estilo dos dois manuais foi para _manual_base.py. Com dois documentos, as
duas copias do estilo iam divergir. O manual interno foi regerado depois da
mudanca e saiu igual: 15 capitulos, 31 tabelas.

Co-Authored-By: Claude Opus 5 (1M context) <noreply@anthropic.com>
</commit_message>
<xml_diff>
--- a/manual/Manual_de_Regras_Folha10_Simples.docx
+++ b/manual/Manual_de_Regras_Folha10_Simples.docx
@@ -9,6 +9,7 @@
       <w:r>
         <w:rPr>
           <w:b/>
+          <w:i w:val="0"/>
           <w:color w:val="1D4ED8"/>
           <w:sz w:val="60"/>
         </w:rPr>
@@ -21,6 +22,8 @@
       </w:pPr>
       <w:r>
         <w:rPr>
+          <w:b w:val="0"/>
+          <w:i w:val="0"/>
           <w:color w:val="475569"/>
           <w:sz w:val="34"/>
         </w:rPr>
@@ -33,6 +36,7 @@
       </w:pPr>
       <w:r>
         <w:rPr>
+          <w:b w:val="0"/>
           <w:i/>
           <w:color w:val="475569"/>
           <w:sz w:val="22"/>
@@ -41,10 +45,10 @@
       </w:r>
     </w:p>
     <w:p/>
-    <w:p/>
     <w:p>
       <w:r>
         <w:rPr>
+          <w:b w:val="0"/>
           <w:i w:val="0"/>
         </w:rPr>
         <w:t>Este manual reúne as regras que já estão definidas e valendo no sistema — não é um projeto do que se pretende fazer. Cada etapa corresponde a um card do menu principal, na mesma ordem em que eles aparecem na tela, e dentro da etapa as regras seguem os grupos e itens daquele card.</w:t>
@@ -53,12 +57,20 @@
     <w:p>
       <w:r>
         <w:rPr>
+          <w:b w:val="0"/>
           <w:i w:val="0"/>
         </w:rPr>
         <w:t>Onde uma regra ainda não está fechada, ela aparece marcada como lacuna em aberto. Preferimos declarar o que falta a preencher com suposição.</w:t>
       </w:r>
     </w:p>
-    <w:p/>
+    <w:p>
+      <w:r>
+        <w:rPr>
+          <w:b w:val="0"/>
+          <w:i w:val="0"/>
+        </w:rPr>
+      </w:r>
+    </w:p>
     <w:tbl>
       <w:tblPr>
         <w:tblStyle w:val="TableGrid"/>
@@ -127,7 +139,7 @@
               <w:rPr>
                 <w:sz w:val="19"/>
               </w:rPr>
-              <w:t>20260809-0921</w:t>
+              <w:t>20260809-0947</w:t>
             </w:r>
           </w:p>
         </w:tc>
@@ -228,7 +240,14 @@
         <w:spacing w:after="40"/>
       </w:pPr>
     </w:p>
-    <w:p/>
+    <w:p>
+      <w:r>
+        <w:rPr>
+          <w:b w:val="0"/>
+          <w:i w:val="0"/>
+        </w:rPr>
+      </w:r>
+    </w:p>
     <w:p>
       <w:pPr>
         <w:pStyle w:val="Heading2"/>
@@ -435,6 +454,7 @@
     <w:p>
       <w:r>
         <w:rPr>
+          <w:b w:val="0"/>
           <w:i w:val="0"/>
         </w:rPr>
         <w:t>Estas regras não pertencem a um card do menu: elas atravessam todos. Quase todo comportamento estranho relatado no dia a dia cai em uma delas.</w:t>
@@ -994,6 +1014,7 @@
     <w:p>
       <w:r>
         <w:rPr>
+          <w:b w:val="0"/>
           <w:i w:val="0"/>
         </w:rPr>
         <w:t>O card reúne cinco grupos: Funcionário, Tabelas Auxiliares, Pensão Alimentícia e Empresa. Com a folha calculada ou fechada, os cadastros ficam bloqueados — só Nova Empresa continua liberado.</w:t>
@@ -1172,6 +1193,7 @@
     <w:p>
       <w:r>
         <w:rPr>
+          <w:b w:val="0"/>
           <w:i w:val="0"/>
         </w:rPr>
         <w:t>A admissão retroativa é quase sempre implantação: o evento já foi transmitido pelo sistema anterior, e um S-2200 duplicado dá trabalho para desfazer no eSocial. Se o evento realmente precisar ir, o caminho é o Gerador de Remessa.</w:t>
@@ -1242,6 +1264,7 @@
     <w:p>
       <w:r>
         <w:rPr>
+          <w:b w:val="0"/>
           <w:i w:val="0"/>
         </w:rPr>
         <w:t>É a matrícula pela qual o eSocial já conhece o trabalhador — usada quando ele veio de outro sistema. Nas inclusões normais vem igual à matrícula.</w:t>
@@ -1721,6 +1744,7 @@
     <w:p>
       <w:r>
         <w:rPr>
+          <w:b w:val="0"/>
           <w:i w:val="0"/>
         </w:rPr>
         <w:t>O estagiário (901) sofre apenas IRRF: sem INSS e sem FGTS.</w:t>
@@ -1748,6 +1772,7 @@
     <w:p>
       <w:r>
         <w:rPr>
+          <w:b w:val="0"/>
           <w:i w:val="0"/>
         </w:rPr>
         <w:t>Em branco, vale o nome da função pelo CBO. Preenchido, tem precedência. Serve para o caso de duas funções diferentes compartilharem o mesmo CBO. É lido pelo TRCT e pelos eventos S-2200, S-2300 e S-2206.</w:t>
@@ -1764,6 +1789,7 @@
     <w:p>
       <w:r>
         <w:rPr>
+          <w:b w:val="0"/>
           <w:i w:val="0"/>
         </w:rPr>
         <w:t>O vínculo é por CNPJ (tab_cad.cnpjsindcategprof), não por id. NÃO SINDICALIZADO corresponde ao CNPJ 37115367003500.</w:t>
@@ -2321,6 +2347,7 @@
     <w:p>
       <w:r>
         <w:rPr>
+          <w:b w:val="0"/>
           <w:i w:val="0"/>
         </w:rPr>
         <w:t>Como a conversão acontece no cálculo, e não na digitação, o valor acompanha o reajuste sozinho. O “% de acréscimo” soma sobre isso: 50 é hora extra de 50% (×1,5) e 100 é o dobro.</w:t>
@@ -2337,6 +2364,7 @@
     <w:p>
       <w:r>
         <w:rPr>
+          <w:b w:val="0"/>
           <w:i w:val="0"/>
         </w:rPr>
         <w:t>Os campos tpn_ / tpr_ / tpf_ / tp1_ combinados com _inc_cp, _inc_fgts, _inc_irrf e _inc_pis guardam o CÓDIGO DE INCIDÊNCIA DO eSOCIAL — por exemplo, 11 significa incide integralmente. Os prefixos indicam o evento:</w:t>
@@ -2770,6 +2798,7 @@
     <w:p>
       <w:r>
         <w:rPr>
+          <w:b w:val="0"/>
           <w:i w:val="0"/>
         </w:rPr>
         <w:t>É o que faz a hora extra habitual refletir em férias e rescisão. Esquecer disso é a causa mais comum do relato “a média não bateu”.</w:t>
@@ -2995,6 +3024,7 @@
     <w:p>
       <w:r>
         <w:rPr>
+          <w:b w:val="0"/>
           <w:i w:val="0"/>
         </w:rPr>
         <w:t>Para verba que é percentual de outras: escolhendo as verbas da base, o cálculo soma esses valores antes de aplicar o percentual, em vez de usar só o salário.</w:t>
@@ -3057,6 +3087,7 @@
     <w:p>
       <w:r>
         <w:rPr>
+          <w:b w:val="0"/>
           <w:i w:val="0"/>
         </w:rPr>
         <w:t>A tela trabalha com duas listas — responsável e beneficiários — e não tem edição: correção é refazer o registro.</w:t>
@@ -3149,6 +3180,7 @@
     <w:p>
       <w:r>
         <w:rPr>
+          <w:b w:val="0"/>
           <w:i w:val="0"/>
         </w:rPr>
         <w:t>O card abre a competência de trabalho e controla a passagem entre aberta, calculada e fechada.</w:t>
@@ -3221,6 +3253,7 @@
     <w:p>
       <w:r>
         <w:rPr>
+          <w:b w:val="0"/>
           <w:i w:val="0"/>
         </w:rPr>
         <w:t>Fechar consolida a competência; reabrir devolve a folha ao estado editável. O status da folha comanda o que o eSocial aceita receber — ver a Etapa 9.</w:t>
@@ -3270,6 +3303,7 @@
     <w:p>
       <w:r>
         <w:rPr>
+          <w:b w:val="0"/>
           <w:i w:val="0"/>
         </w:rPr>
         <w:t>O card maior do sistema: Férias, Salários, Rescisão, Contrato Temporário, Afastamentos, Faltas, Exame Médico, Insalubridade/Periculosidade e FAP.</w:t>
@@ -3307,6 +3341,7 @@
     <w:p>
       <w:r>
         <w:rPr>
+          <w:b w:val="0"/>
           <w:i w:val="0"/>
         </w:rPr>
         <w:t>Período aquisitivo de 12 meses. Os dias de direito dependem das faltas:</w:t>
@@ -3791,6 +3826,7 @@
     <w:p>
       <w:r>
         <w:rPr>
+          <w:b w:val="0"/>
           <w:i w:val="0"/>
         </w:rPr>
         <w:t>A alteração salarial fica registrada em tab_eventos e alimenta o relatório de salários e a alteração contratual no eSocial (S-2206).</w:t>
@@ -3828,6 +3864,7 @@
     <w:p>
       <w:r>
         <w:rPr>
+          <w:b w:val="0"/>
           <w:i w:val="0"/>
         </w:rPr>
         <w:t>A rescisão já precisa estar REGISTRADA (situação D, com data e motivo). O cálculo lê esse registro e não mexe no cadastro do funcionário.</w:t>
@@ -4497,6 +4534,7 @@
     <w:p>
       <w:r>
         <w:rPr>
+          <w:b w:val="0"/>
           <w:i w:val="0"/>
         </w:rPr>
         <w:t>As médias são REFLEXO: entram no 13º e nas férias e não viram linha própria no recibo.</w:t>
@@ -4513,6 +4551,7 @@
     <w:p>
       <w:r>
         <w:rPr>
+          <w:b w:val="0"/>
           <w:i w:val="0"/>
         </w:rPr>
         <w:t>Reverte o cadastro, apaga o S-2299 pendente e cancela também o aviso prévio que a originou. Só é permitido quando as três condições valem ao mesmo tempo:</w:t>
@@ -4559,6 +4598,7 @@
     <w:p>
       <w:r>
         <w:rPr>
+          <w:b w:val="0"/>
           <w:i w:val="0"/>
         </w:rPr>
         <w:t>Réplica do formulário oficial (Portaria 1057/2012). Lê o que foi PERSISTIDO no cálculo, então é obrigatório calcular a rescisão antes de emitir.</w:t>
@@ -4807,6 +4847,7 @@
     <w:p>
       <w:r>
         <w:rPr>
+          <w:b w:val="0"/>
           <w:i w:val="0"/>
         </w:rPr>
         <w:t>Informando início e fim, saem dois S-2230: a SAÍDA na competência do mês de início e o RETORNO na competência do mês do fim. Um afastamento de 20/07 a 05/08 gera saída em 07/2026 e retorno em 08/2026.</w:t>
@@ -4838,6 +4879,7 @@
     <w:p>
       <w:r>
         <w:rPr>
+          <w:b w:val="0"/>
           <w:i w:val="0"/>
         </w:rPr>
         <w:t>Aparecem duas caixas “Não enviar o S-2230”, uma para a saída e outra para o retorno, JÁ MARCADAS. O padrão é não gerar: afastamento antigo normalmente já foi transmitido, ou está sendo registrado só para a folha enxergar os dias parados. As duas escolhas são independentes uma da outra.</w:t>
@@ -4874,6 +4916,7 @@
     <w:p>
       <w:r>
         <w:rPr>
+          <w:b w:val="0"/>
           <w:i w:val="0"/>
         </w:rPr>
         <w:t>“Mesmo motivo” importa para o INSS: afastamentos pela mesma causa em menos de 60 dias se somam, e isso muda de quem é a responsabilidade pelo pagamento.</w:t>
@@ -4966,6 +5009,7 @@
     <w:p>
       <w:r>
         <w:rPr>
+          <w:b w:val="0"/>
           <w:i w:val="0"/>
         </w:rPr>
         <w:t>Lançamentos da competência: o que varia de um mês para o outro.</w:t>
@@ -5025,6 +5069,7 @@
     <w:p>
       <w:r>
         <w:rPr>
+          <w:b w:val="0"/>
           <w:i w:val="0"/>
         </w:rPr>
         <w:t>As verbas 700 a 749 (empréstimo consignado) não se cadastram como movimento fixo: cada contrato tem banco, número e prazo próprios, que só chegam pela planilha mensal. A importação apaga e regrava a faixa inteira a cada rodada.</w:t>
@@ -5203,6 +5248,7 @@
     <w:p>
       <w:r>
         <w:rPr>
+          <w:b w:val="0"/>
           <w:i w:val="0"/>
         </w:rPr>
         <w:t>O “não adianta” é gravado em tab_cad.sem_adiantamento (booleano). Não é possível usar 0 nem -1 nas colunas de valor: o banco tem CHECK exigindo valor_adianta &gt; 0 e per_adianta entre 10 e 60. Digitar 0 na tela funciona como atalho para marcar a caixa.</w:t>
@@ -5330,6 +5376,7 @@
     <w:p>
       <w:r>
         <w:rPr>
+          <w:b w:val="0"/>
           <w:i w:val="0"/>
         </w:rPr>
         <w:t>O divisor são os dias reais do mês (30, 31 ou 28) — a mesma regra da etapa 1030 do cálculo. Exemplo: salário 3.000,00 com 40%, admitido em 05/07 → 1.200,00 × 27/31 = 1.045,16.</w:t>
@@ -5513,6 +5560,7 @@
     <w:p>
       <w:r>
         <w:rPr>
+          <w:b w:val="0"/>
           <w:i w:val="0"/>
         </w:rPr>
         <w:t>Lançamento cadastrado UMA VEZ que o sistema repete a cada folha. Entra no tab_mov com origem F, indicando que foi o cálculo que gerou.</w:t>
@@ -5968,6 +6016,7 @@
     <w:p>
       <w:r>
         <w:rPr>
+          <w:b w:val="0"/>
           <w:i w:val="0"/>
         </w:rPr>
         <w:t>Existem ainda as opções “Se afastado” (continuar, interromper ou proporcional) e o tratamento do mês de admissão e do mês de rescisão (total ou proporcional).</w:t>
@@ -6153,6 +6202,7 @@
     <w:p>
       <w:r>
         <w:rPr>
+          <w:b w:val="0"/>
           <w:i w:val="0"/>
         </w:rPr>
         <w:t>A trava existe porque excluir algo que já rodou em folha paga apagaria o histórico de um valor efetivamente pago. Ela vale também no servidor.</w:t>
@@ -6208,6 +6258,7 @@
     <w:p>
       <w:r>
         <w:rPr>
+          <w:b w:val="0"/>
           <w:i w:val="0"/>
         </w:rPr>
         <w:t>Mostra por padrão só os movimentos EM VIGÊNCIA. A caixa “Mostrar também os encerrados” traz o resto. Encerrado significa que a folha final já passou da folha ativa.</w:t>
@@ -6250,6 +6301,7 @@
     <w:p>
       <w:r>
         <w:rPr>
+          <w:b w:val="0"/>
           <w:i w:val="0"/>
         </w:rPr>
         <w:t>A memória numera as etapas de 10 em 10, para caber etapa nova no meio sem renumerar tudo.</w:t>
@@ -7082,6 +7134,7 @@
     <w:p>
       <w:r>
         <w:rPr>
+          <w:b w:val="0"/>
           <w:i w:val="0"/>
         </w:rPr>
         <w:t>INSS, IRRF e salário mínimo ficam DENTRO do sistema — o cliente não configura. A vigência é por ano_mes_inicio, e a busca usa o maior valor menor ou igual à competência da folha. Uma vez gravadas, nunca são alteradas.</w:t>
@@ -7146,6 +7199,7 @@
     <w:p>
       <w:r>
         <w:rPr>
+          <w:b w:val="0"/>
           <w:i w:val="0"/>
         </w:rPr>
         <w:t>O sistema calcula pelos DOIS métodos — completo e simplificado — e usa o mais favorável ao funcionário.</w:t>
@@ -7173,6 +7227,7 @@
     <w:p>
       <w:r>
         <w:rPr>
+          <w:b w:val="0"/>
           <w:i w:val="0"/>
         </w:rPr>
         <w:t>Quem recolhe é definido pela CATEGORIA, não pela incidência da rubrica. As categorias 700 a 799 e a 901 não recolhem, com a única exceção da 721.</w:t>
@@ -7204,6 +7259,7 @@
     <w:p>
       <w:r>
         <w:rPr>
+          <w:b w:val="0"/>
           <w:i w:val="0"/>
         </w:rPr>
         <w:t>Fórmula: base ÷ dias úteis × (domingos + feriados).</w:t>
@@ -7372,6 +7428,7 @@
     <w:p>
       <w:r>
         <w:rPr>
+          <w:b w:val="0"/>
           <w:i w:val="0"/>
         </w:rPr>
         <w:t>Insalubridade é percentual do salário mínimo; periculosidade é percentual do salário base. Ver a lacuna declarada na Etapa 3.</w:t>
@@ -7406,6 +7463,7 @@
     <w:p>
       <w:r>
         <w:rPr>
+          <w:b w:val="0"/>
           <w:i w:val="0"/>
         </w:rPr>
         <w:t>O card agrupa relatórios de Cadastros, Eventos, Folha de Pagamento, o Gerador e os relatórios de Sistema.</w:t>
@@ -7611,6 +7669,7 @@
     <w:p>
       <w:r>
         <w:rPr>
+          <w:b w:val="0"/>
           <w:i w:val="0"/>
         </w:rPr>
         <w:t>Todo relatório usa o mesmo cabeçalho de três colunas: empresa e nome do usuário à esquerda; título e badge da folha no centro; logo, versão e botão Voltar à direita.</w:t>
@@ -7717,6 +7776,7 @@
     <w:p>
       <w:r>
         <w:rPr>
+          <w:b w:val="0"/>
           <w:i w:val="0"/>
         </w:rPr>
         <w:t>Sem regra adicional documentada até esta edição do manual.</w:t>
@@ -7751,6 +7811,7 @@
     <w:p>
       <w:r>
         <w:rPr>
+          <w:b w:val="0"/>
           <w:i w:val="0"/>
         </w:rPr>
         <w:t>O card segue a ordem natural do eSocial: primeiro as tabelas, depois os eventos não periódicos, depois os periódicos.</w:t>
@@ -8166,6 +8227,7 @@
     <w:p>
       <w:r>
         <w:rPr>
+          <w:b w:val="0"/>
           <w:i w:val="0"/>
         </w:rPr>
         <w:t>Ao mandar um S-1200 o sistema confere três coisas, nesta ordem de gravidade. As duas primeiras BARRAM o envio: são recusa certa do eSocial, e a mensagem do governo não diz qual rubrica ou lotação faltou.</w:t>
@@ -8374,6 +8436,7 @@
     <w:p>
       <w:r>
         <w:rPr>
+          <w:b w:val="0"/>
           <w:i w:val="0"/>
         </w:rPr>
         <w:t>A vigência conta: rubrica declarada com início de validade em 07/2026 não cobre a folha de 06/2026. Verba informativa (código 9900 ou maior) fica de fora, porque não vai no S-1200.</w:t>
@@ -8608,6 +8671,7 @@
     <w:p>
       <w:r>
         <w:rPr>
+          <w:b w:val="0"/>
           <w:i w:val="0"/>
         </w:rPr>
         <w:t>A senha é cifrada com chave derivada do FLASK_SECRET_KEY, que é DIFERENTE entre o ambiente local e o Render. Certificado salvo localmente só abre localmente.</w:t>
@@ -8693,6 +8757,7 @@
     <w:p>
       <w:r>
         <w:rPr>
+          <w:b w:val="0"/>
           <w:i w:val="0"/>
         </w:rPr>
         <w:t>Confronta o que o Folha10 calculou com os totalizadores devolvidos pelo governo. Os S-5001 e S-5003 vêm do retorno do S-1200 e o S-5002 vem do retorno do S-1210 — nunca do S-1299.</w:t>
@@ -8791,6 +8856,7 @@
     <w:p>
       <w:r>
         <w:rPr>
+          <w:b w:val="0"/>
           <w:i w:val="0"/>
         </w:rPr>
         <w:t>Sem regra adicional documentada até esta edição do manual.</w:t>
@@ -8967,6 +9033,7 @@
     <w:p>
       <w:r>
         <w:rPr>
+          <w:b w:val="0"/>
           <w:i w:val="0"/>
         </w:rPr>
         <w:t>Regras que não pertencem a uma tela, mas derrubam qualquer uma delas.</w:t>
@@ -9024,6 +9091,7 @@
     <w:p>
       <w:r>
         <w:rPr>
+          <w:b w:val="0"/>
           <w:i w:val="0"/>
         </w:rPr>
         <w:t>E ignora limite maior: pedir 5000 devolve 1000. Consulta em lote para validar “já existe” pode dar falso negativo. Comportamento testado. Toda leitura que precisa ser completa tem que paginar.</w:t>
@@ -9370,6 +9438,7 @@
     <w:p>
       <w:r>
         <w:rPr>
+          <w:b w:val="0"/>
           <w:i w:val="0"/>
         </w:rPr>
         <w:t>O isolamento entre clientes é feito exclusivamente pelo .eq("id_cliente") no código Python. Decisão adiada — lacuna conhecida e aceita.</w:t>
@@ -9399,6 +9468,7 @@
     <w:p>
       <w:r>
         <w:rPr>
+          <w:b w:val="0"/>
           <w:i w:val="0"/>
         </w:rPr>
         <w:t>Três colunas: empresa e nome do usuário | título e badge da folha | logo, versão e botão Voltar. Fonte IBM Plex em todas as telas.</w:t>
@@ -9415,6 +9485,7 @@
     <w:p>
       <w:r>
         <w:rPr>
+          <w:b w:val="0"/>
           <w:i w:val="0"/>
         </w:rPr>
         <w:t>Verde, em formato de pílula, alinhado à DIREITA do cabeçalho da tela. Abre um painel próprio, não um alerta de texto puro. O texto mora num parcial _ajuda_&lt;modulo&gt;.html, incluído tanto na tela quanto no card do menu — editar num lugar só vale para os dois.</w:t>
@@ -9431,6 +9502,7 @@
     <w:p>
       <w:r>
         <w:rPr>
+          <w:b w:val="0"/>
           <w:i w:val="0"/>
         </w:rPr>
         <w:t>Ao selecionar um card, o grid é escondido e dá lugar a uma barra compacta com o botão Trocar, para a lista ocupar toda a área.</w:t>
@@ -9447,6 +9519,7 @@
     <w:p>
       <w:r>
         <w:rPr>
+          <w:b w:val="0"/>
           <w:i w:val="0"/>
         </w:rPr>
         <w:t>As telas com tour usam Driver.js, acionado pelo botão “?” no canto inferior direito.</w:t>
@@ -9463,6 +9536,7 @@
     <w:p>
       <w:r>
         <w:rPr>
+          <w:b w:val="0"/>
           <w:i w:val="0"/>
         </w:rPr>
         <w:t>O arquivo versaoxxx.txt é atualizado a cada alteração rodando python _gravar_versao.py, que pega a hora de Brasília. A hora nunca é digitada à mão.</w:t>
@@ -9492,6 +9566,7 @@
     <w:p>
       <w:r>
         <w:rPr>
+          <w:b w:val="0"/>
           <w:i w:val="0"/>
         </w:rPr>
         <w:t>Constantes no app.py: CLIENTES_SEM_ENCARGOS e CLIENTES_SEM_DSR.</w:t>
@@ -9538,6 +9613,7 @@
     <w:p>
       <w:r>
         <w:rPr>
+          <w:b w:val="0"/>
           <w:i w:val="0"/>
         </w:rPr>
         <w:t>Emite NFS-e com ISS retido pelo tomador a 5%, com endereço fixo. O DANFSe mostra alíquota, base de cálculo, ISS apurado e ISS retido.</w:t>
@@ -9554,6 +9630,7 @@
     <w:p>
       <w:r>
         <w:rPr>
+          <w:b w:val="0"/>
           <w:i w:val="0"/>
         </w:rPr>
         <w:t>Todo usuário do id_cliente 4 tem o módulo Admin, o Trocar Cliente e pode alterar as verbas de sistema (código abaixo de 1000).</w:t>
@@ -9575,6 +9652,7 @@
     <w:p>
       <w:r>
         <w:rPr>
+          <w:b w:val="0"/>
           <w:i w:val="0"/>
         </w:rPr>
         <w:t>Reúne o que já está definido e valendo. Onde a regra ainda não está fechada, o texto diz isso — as lacunas declaradas hoje são:</w:t>
@@ -9613,6 +9691,7 @@
     <w:p>
       <w:r>
         <w:rPr>
+          <w:b w:val="0"/>
           <w:i w:val="0"/>
         </w:rPr>
       </w:r>
@@ -9620,10 +9699,11 @@
     <w:p>
       <w:r>
         <w:rPr>
+          <w:b w:val="0"/>
           <w:i/>
           <w:color w:val="475569"/>
         </w:rPr>
-        <w:t>Folha10 Simples — versão 20260809-0921. Documento gerado em 09/08/2026.</w:t>
+        <w:t>Folha10 Simples — versão 20260809-0947. Documento gerado em 09/08/2026.</w:t>
       </w:r>
     </w:p>
     <w:sectPr>
@@ -9665,7 +9745,7 @@
         <w:sz w:val="17"/>
       </w:rPr>
       <w:tab/>
-      <w:t>versão 20260809-0921</w:t>
+      <w:t>versão 20260809-0947</w:t>
     </w:r>
   </w:p>
 </w:hdr>

</xml_diff>

<commit_message>
Manuais: tira SEFIP/GFIP e exportacao para contabilidade
Nao existe mais no sistema. Sai dos dois manuais; a Etapa 8 fica so com o
pagamento bancario.

Co-Authored-By: Claude Opus 5 (1M context) <noreply@anthropic.com>
</commit_message>
<xml_diff>
--- a/manual/Manual_de_Regras_Folha10_Simples.docx
+++ b/manual/Manual_de_Regras_Folha10_Simples.docx
@@ -139,7 +139,7 @@
               <w:rPr>
                 <w:sz w:val="19"/>
               </w:rPr>
-              <w:t>20260809-0947</w:t>
+              <w:t>20260809-1134</w:t>
             </w:r>
           </w:p>
         </w:tc>
@@ -7753,36 +7753,6 @@
       </w:r>
     </w:p>
     <w:p>
-      <w:pPr>
-        <w:pStyle w:val="Heading2"/>
-      </w:pPr>
-      <w:r>
-        <w:t>Integração</w:t>
-      </w:r>
-    </w:p>
-    <w:p>
-      <w:pPr>
-        <w:spacing w:after="160"/>
-      </w:pPr>
-      <w:r>
-        <w:rPr>
-          <w:i/>
-          <w:color w:val="475569"/>
-          <w:sz w:val="19"/>
-        </w:rPr>
-        <w:t>SEFIP / GFIP · Exportar para Contabilidade</w:t>
-      </w:r>
-    </w:p>
-    <w:p>
-      <w:r>
-        <w:rPr>
-          <w:b w:val="0"/>
-          <w:i w:val="0"/>
-        </w:rPr>
-        <w:t>Sem regra adicional documentada até esta edição do manual.</w:t>
-      </w:r>
-    </w:p>
-    <w:p>
       <w:r>
         <w:br w:type="page"/>
       </w:r>
@@ -9703,7 +9673,7 @@
           <w:i/>
           <w:color w:val="475569"/>
         </w:rPr>
-        <w:t>Folha10 Simples — versão 20260809-0947. Documento gerado em 09/08/2026.</w:t>
+        <w:t>Folha10 Simples — versão 20260809-1134. Documento gerado em 09/08/2026.</w:t>
       </w:r>
     </w:p>
     <w:sectPr>
@@ -9745,7 +9715,7 @@
         <w:sz w:val="17"/>
       </w:rPr>
       <w:tab/>
-      <w:t>versão 20260809-0947</w:t>
+      <w:t>versão 20260809-1134</w:t>
     </w:r>
   </w:p>
 </w:hdr>

</xml_diff>